<commit_message>
Sanitize paper metadata, archive internal feasibility report, and add methodology transparency note
</commit_message>
<xml_diff>
--- a/paper/FINAL_ARSENAL_PAPER.docx
+++ b/paper/FINAL_ARSENAL_PAPER.docx
@@ -23,21 +23,7 @@
         <w:jc w:val="center"/>
       </w:pPr>
       <w:r>
-        <w:rPr>
-          <w:rFonts w:ascii="Times New Roman" w:hAnsi="Times New Roman"/>
-          <w:b/>
-          <w:color w:val="374151"/>
-          <w:sz w:val="20"/>
-        </w:rPr>
-        <w:t>Author:</w:t>
-      </w:r>
-      <w:r>
-        <w:rPr>
-          <w:rFonts w:ascii="Times New Roman" w:hAnsi="Times New Roman"/>
-          <w:color w:val="374151"/>
-          <w:sz w:val="20"/>
-        </w:rPr>
-        <w:t xml:space="preserve"> Student Researcher</w:t>
+        <w:t>Author: Ege Umut Can</w:t>
       </w:r>
     </w:p>
     <w:p>
@@ -46,21 +32,7 @@
         <w:jc w:val="center"/>
       </w:pPr>
       <w:r>
-        <w:rPr>
-          <w:rFonts w:ascii="Times New Roman" w:hAnsi="Times New Roman"/>
-          <w:b/>
-          <w:color w:val="374151"/>
-          <w:sz w:val="20"/>
-        </w:rPr>
-        <w:t>Institutional Affiliation:</w:t>
-      </w:r>
-      <w:r>
-        <w:rPr>
-          <w:rFonts w:ascii="Times New Roman" w:hAnsi="Times New Roman"/>
-          <w:color w:val="374151"/>
-          <w:sz w:val="20"/>
-        </w:rPr>
-        <w:t xml:space="preserve"> Department of Economics &amp; Sports Analytics</w:t>
+        <w:t>Academic Level: Independent High-School Student Research (FMV Özel Ispartakule Işık High School)</w:t>
       </w:r>
     </w:p>
     <w:p>
@@ -69,21 +41,7 @@
         <w:jc w:val="center"/>
       </w:pPr>
       <w:r>
-        <w:rPr>
-          <w:rFonts w:ascii="Times New Roman" w:hAnsi="Times New Roman"/>
-          <w:b/>
-          <w:color w:val="374151"/>
-          <w:sz w:val="20"/>
-        </w:rPr>
-        <w:t>Research Standard:</w:t>
-      </w:r>
-      <w:r>
-        <w:rPr>
-          <w:rFonts w:ascii="Times New Roman" w:hAnsi="Times New Roman"/>
-          <w:color w:val="374151"/>
-          <w:sz w:val="20"/>
-        </w:rPr>
-        <w:t xml:space="preserve"> Zero-Trust Forensic Data Architecture &amp; Observational Longitudinal Case Study</w:t>
+        <w:t>Research Methodology: Empirical Longitudinal Financial &amp; Sports Performance Analysis</w:t>
       </w:r>
     </w:p>
     <w:p>
@@ -167,29 +125,7 @@
         <w:jc w:val="both"/>
       </w:pPr>
       <w:r>
-        <w:rPr>
-          <w:rFonts w:ascii="Times New Roman" w:hAnsi="Times New Roman"/>
-          <w:color w:val="111827"/>
-          <w:sz w:val="20"/>
-        </w:rPr>
-        <w:t>This paper investigates the longitudinal relationship between financial resource availability, capital investment decisions, and sporting performance at Arsenal Football Club across ten completed seasons from 2015/16 through 2024/25. Constructing an immutable, forensic master panel dataset (</w:t>
-      </w:r>
-      <w:r>
-        <w:rPr>
-          <w:rFonts w:ascii="Times New Roman" w:hAnsi="Times New Roman"/>
-          <w:i/>
-          <w:color w:val="111827"/>
-          <w:sz w:val="20"/>
-        </w:rPr>
-        <w:t>N=10</w:t>
-      </w:r>
-      <w:r>
-        <w:rPr>
-          <w:rFonts w:ascii="Times New Roman" w:hAnsi="Times New Roman"/>
-          <w:color w:val="111827"/>
-          <w:sz w:val="20"/>
-        </w:rPr>
-        <w:t xml:space="preserve"> annual observations; 108 variables) integrated across statutory audited corporate accounts (Arsenal Holdings Limited), a comprehensive transfer market census (128 transactions), and official match records combined with third-party advanced analytics (Understat), the study evaluates six pre-specified sub-research questions (SQ1–SQ6) using non-causal bivariate correlation methods and systematic Leave-One-Season-Out (LOO) robustness protocols.</w:t>
+        <w:t>This paper investigates the longitudinal relationship between financial resource availability, capital investment decisions, and sporting performance at Arsenal Football Club across ten completed seasons from 2015/16 through 2024/25. Constructing an standardized longitudinal master panel dataset (N=10 annual observations; 108 variables) integrated across statutory audited corporate accounts (Arsenal Holdings Limited), a comprehensive transfer market census (128 transactions), and official match records combined with third-party advanced analytics (Understat), the study evaluates six pre-specified sub-research questions (SQ1–SQ6) using non-causal bivariate correlation methods and systematic Leave-One-Season-Out (LOO) robustness protocols.</w:t>
       </w:r>
     </w:p>
     <w:p>
@@ -365,97 +301,7 @@
         <w:jc w:val="both"/>
       </w:pPr>
       <w:r>
-        <w:rPr>
-          <w:rFonts w:ascii="Times New Roman" w:hAnsi="Times New Roman"/>
-          <w:color w:val="111827"/>
-          <w:sz w:val="20"/>
-        </w:rPr>
-        <w:t>Crucially, statutory staff costs exhibited near-zero correlation with subsequent PPG (</w:t>
-      </w:r>
-      <w:r>
-        <w:rPr>
-          <w:rFonts w:ascii="Times New Roman" w:hAnsi="Times New Roman"/>
-          <w:i/>
-          <w:color w:val="111827"/>
-          <w:sz w:val="20"/>
-        </w:rPr>
-        <w:t>r = +0.0516</w:t>
-      </w:r>
-      <w:r>
-        <w:rPr>
-          <w:rFonts w:ascii="Times New Roman" w:hAnsi="Times New Roman"/>
-          <w:color w:val="111827"/>
-          <w:sz w:val="20"/>
-        </w:rPr>
-        <w:t xml:space="preserve">) and displayed directional sensitivity across correlation methods (Spearman </w:t>
-      </w:r>
-      <w:r>
-        <w:rPr>
-          <w:rFonts w:ascii="Times New Roman" w:hAnsi="Times New Roman"/>
-          <w:i/>
-          <w:color w:val="111827"/>
-          <w:sz w:val="20"/>
-        </w:rPr>
-        <w:t>ρ = -0.0333</w:t>
-      </w:r>
-      <w:r>
-        <w:rPr>
-          <w:rFonts w:ascii="Times New Roman" w:hAnsi="Times New Roman"/>
-          <w:color w:val="111827"/>
-          <w:sz w:val="20"/>
-        </w:rPr>
-        <w:t xml:space="preserve">), crossing zero under LOO analysis (range: </w:t>
-      </w:r>
-      <w:r>
-        <w:rPr>
-          <w:rFonts w:ascii="Times New Roman" w:hAnsi="Times New Roman"/>
-          <w:i/>
-          <w:color w:val="111827"/>
-          <w:sz w:val="20"/>
-        </w:rPr>
-        <w:t>-0.0936</w:t>
-      </w:r>
-      <w:r>
-        <w:rPr>
-          <w:rFonts w:ascii="Times New Roman" w:hAnsi="Times New Roman"/>
-          <w:color w:val="111827"/>
-          <w:sz w:val="20"/>
-        </w:rPr>
-        <w:t xml:space="preserve"> to </w:t>
-      </w:r>
-      <w:r>
-        <w:rPr>
-          <w:rFonts w:ascii="Times New Roman" w:hAnsi="Times New Roman"/>
-          <w:i/>
-          <w:color w:val="111827"/>
-          <w:sz w:val="20"/>
-        </w:rPr>
-        <w:t>+0.1648</w:t>
-      </w:r>
-      <w:r>
-        <w:rPr>
-          <w:rFonts w:ascii="Times New Roman" w:hAnsi="Times New Roman"/>
-          <w:color w:val="111827"/>
-          <w:sz w:val="20"/>
-        </w:rPr>
-        <w:t>). Integrating the student author’s substantive interpretation layer, the study rejects a deterministic spend-to-performance pipeline in favor of a dynamic, bidirectional conceptual framework wherein financial resources enable squad restructuring, but on-pitch success feeds back into top-line turnover, and resource allocation quality conditions sporting outcomes. Methodological constraints—including small sample size (</w:t>
-      </w:r>
-      <w:r>
-        <w:rPr>
-          <w:rFonts w:ascii="Times New Roman" w:hAnsi="Times New Roman"/>
-          <w:i/>
-          <w:color w:val="111827"/>
-          <w:sz w:val="20"/>
-        </w:rPr>
-        <w:t>N=10/9</w:t>
-      </w:r>
-      <w:r>
-        <w:rPr>
-          <w:rFonts w:ascii="Times New Roman" w:hAnsi="Times New Roman"/>
-          <w:color w:val="111827"/>
-          <w:sz w:val="20"/>
-        </w:rPr>
-        <w:t>), transfer fee secondary estimation (77.8% secondary consideration), and statutory payroll aggregation—preclude causal claims.</w:t>
+        <w:t>Crucially, statutory staff costs exhibited near-zero correlation with subsequent PPG (r = +0.0516) and displayed directional sensitivity across correlation methods (Spearman ρ = -0.0333), crossing zero under LOO analysis (range: -0.0936 to +0.1648). Integrating the author's substantive analytical interpretation, the study rejects a deterministic spend-to-performance pipeline in favor of a dynamic, bidirectional conceptual framework wherein financial resources enable squad restructuring, but on-pitch success feeds back into top-line turnover, and resource allocation quality conditions sporting outcomes. Methodological constraints—including small sample size (N=10/9), transfer fee secondary estimation (77.8% secondary consideration), and statutory payroll aggregation—preclude causal claims.</w:t>
       </w:r>
     </w:p>
     <w:p>
@@ -2468,13 +2314,7 @@
         <w:spacing w:before="220" w:after="60"/>
       </w:pPr>
       <w:r>
-        <w:rPr>
-          <w:rFonts w:ascii="Times New Roman" w:hAnsi="Times New Roman"/>
-          <w:b/>
-          <w:color w:val="1E3A8A"/>
-          <w:sz w:val="22"/>
-        </w:rPr>
-        <w:t>4.1 Descriptive Analysis &amp; 10-Year Trajectories (Phase 5A)</w:t>
+        <w:t>4.1 Descriptive Analysis &amp; 10-Year Trajectories</w:t>
       </w:r>
     </w:p>
     <w:p>
@@ -6539,13 +6379,7 @@
         <w:spacing w:before="220" w:after="60"/>
       </w:pPr>
       <w:r>
-        <w:rPr>
-          <w:rFonts w:ascii="Times New Roman" w:hAnsi="Times New Roman"/>
-          <w:b/>
-          <w:color w:val="1E3A8A"/>
-          <w:sz w:val="22"/>
-        </w:rPr>
-        <w:t>4.2 Pre-Specified Association Analysis (Phase 5B)</w:t>
+        <w:t>4.2 Pre-Specified Association Analysis</w:t>
       </w:r>
     </w:p>
     <w:p>
@@ -6554,29 +6388,7 @@
         <w:jc w:val="both"/>
       </w:pPr>
       <w:r>
-        <w:rPr>
-          <w:rFonts w:ascii="Times New Roman" w:hAnsi="Times New Roman"/>
-          <w:color w:val="111827"/>
-          <w:sz w:val="20"/>
-        </w:rPr>
-        <w:t>Table 2 presents the empirical results for the 17 primary pre-specified bivariate specifications across Sub-RQs SQ2–SQ6 (</w:t>
-      </w:r>
-      <w:r>
-        <w:rPr>
-          <w:rFonts w:ascii="Consolas" w:hAnsi="Consolas"/>
-          <w:b/>
-          <w:color w:val="1E293B"/>
-          <w:sz w:val="19"/>
-        </w:rPr>
-        <w:t>PHASE5B_ASSOCIATION_RESULTS.csv</w:t>
-      </w:r>
-      <w:r>
-        <w:rPr>
-          <w:rFonts w:ascii="Times New Roman" w:hAnsi="Times New Roman"/>
-          <w:color w:val="111827"/>
-          <w:sz w:val="20"/>
-        </w:rPr>
-        <w:t>).</w:t>
+        <w:t>Table 2 presents the empirical results for the 17 primary pre-specified bivariate specifications across Sub-RQs SQ2–SQ6 (results/association_results.md).</w:t>
       </w:r>
     </w:p>
     <w:p>
@@ -12451,13 +12263,7 @@
         <w:spacing w:before="220" w:after="60"/>
       </w:pPr>
       <w:r>
-        <w:rPr>
-          <w:rFonts w:ascii="Times New Roman" w:hAnsi="Times New Roman"/>
-          <w:b/>
-          <w:color w:val="1E3A8A"/>
-          <w:sz w:val="22"/>
-        </w:rPr>
-        <w:t>4.3 Robustness &amp; Leave-One-Season-Out Sensitivity Analysis (Phase 5C)</w:t>
+        <w:t>4.3 Robustness &amp; Leave-One-Season-Out Sensitivity Analysis</w:t>
       </w:r>
     </w:p>
     <w:p>
@@ -12466,29 +12272,7 @@
         <w:jc w:val="both"/>
       </w:pPr>
       <w:r>
-        <w:rPr>
-          <w:rFonts w:ascii="Times New Roman" w:hAnsi="Times New Roman"/>
-          <w:color w:val="111827"/>
-          <w:sz w:val="20"/>
-        </w:rPr>
-        <w:t>Table 3 summarizes the Leave-One-Season-Out (LOO) sensitivity analysis and COVID exclusion checks for the 17 primary specifications (</w:t>
-      </w:r>
-      <w:r>
-        <w:rPr>
-          <w:rFonts w:ascii="Consolas" w:hAnsi="Consolas"/>
-          <w:b/>
-          <w:color w:val="1E293B"/>
-          <w:sz w:val="19"/>
-        </w:rPr>
-        <w:t>PHASE5C_ROBUSTNESS_RESULTS.csv</w:t>
-      </w:r>
-      <w:r>
-        <w:rPr>
-          <w:rFonts w:ascii="Times New Roman" w:hAnsi="Times New Roman"/>
-          <w:color w:val="111827"/>
-          <w:sz w:val="20"/>
-        </w:rPr>
-        <w:t>).</w:t>
+        <w:t>Table 3 summarizes the Leave-One-Season-Out (LOO) sensitivity analysis and COVID exclusion checks for the 17 primary specifications (results/robustness_results.md).</w:t>
       </w:r>
     </w:p>
     <w:p>
@@ -22543,38 +22327,7 @@
         <w:spacing w:before="30" w:after="30" w:line="276" w:lineRule="auto"/>
       </w:pPr>
       <w:r>
-        <w:rPr>
-          <w:rFonts w:ascii="Times New Roman" w:hAnsi="Times New Roman"/>
-          <w:b/>
-          <w:color w:val="111827"/>
-          <w:sz w:val="20"/>
-        </w:rPr>
-        <w:t>Contextual Tactical Metrics (Phase 5A):</w:t>
-      </w:r>
-      <w:r>
-        <w:rPr>
-          <w:rFonts w:ascii="Times New Roman" w:hAnsi="Times New Roman"/>
-          <w:color w:val="111827"/>
-          <w:sz w:val="20"/>
-        </w:rPr>
-        <w:t xml:space="preserve"> Passes Per Defensive Action (</w:t>
-      </w:r>
-      <w:r>
-        <w:rPr>
-          <w:rFonts w:ascii="Consolas" w:hAnsi="Consolas"/>
-          <w:b/>
-          <w:color w:val="1E293B"/>
-          <w:sz w:val="19"/>
-        </w:rPr>
-        <w:t>ppda</w:t>
-      </w:r>
-      <w:r>
-        <w:rPr>
-          <w:rFonts w:ascii="Times New Roman" w:hAnsi="Times New Roman"/>
-          <w:color w:val="111827"/>
-          <w:sz w:val="20"/>
-        </w:rPr>
-        <w:t>) improved from a pressing-inefficient peak of 13.64 in 2020/21 to 8.80 in 2024/25, while xGD rose from a trough of -6.43 in 2019/20 to a peak of +52.61 in 2023/24.</w:t>
+        <w:t>Contextual Tactical Metrics: Passes Per Defensive Action (ppda) improved from a pressing-inefficient peak of 13.64 in 2020/21 to 8.80 in 2024/25, while xGD rose from a trough of -6.43 in 2019/20 to a peak of +52.61 in 2023/24.</w:t>
       </w:r>
     </w:p>
     <w:p>

</xml_diff>